<commit_message>
Draft_005: fix APA refs (Ningrum et al.; Petchkij pages)
- Replace misattributed Rahayu & Suhartono with Ningrum, Puspita & Mulyadi
  (in-text narrative, parenthetical, and reference list; alphabetized)
- Petchkij (2019) page range 1–22 → 95–113
Overwrite Draft_005 (no new draft number).
</commit_message>
<xml_diff>
--- a/thesis/003_ThesisProposal_Draft_005.docx
+++ b/thesis/003_ThesisProposal_Draft_005.docx
@@ -981,7 +981,7 @@
           <w:i w:val="0"/>
           <w:sz w:val="22"/>
         </w:rPr>
-        <w:t>A 2024 ASEAN-wide study using the ICNALE learner corpus found that EFL learners across ten countries, including the Philippines, exhibit a preference for boosters over hedges. Rahayu and Suhartono (2024) noted that learners overused boosters such as completely, really, and always, while they also showed patterns in hedges such as usually, often, and maybe. This suggests a regional tendency toward assertiveness rather than caution in developing researchers' writing. Locally, Escalona (2025) examined hedges and boosters in the essays of AB-English and BS-Information Technology developing researchers at Bukidnon State University. The study found that developing researchers’ use of these devices varied by discipline. IT developing researchers showed greater reliance on hedges to convey caution given the technical and rapidly evolving nature of their field. English language developing researchers showed greater preference for boosters in asserting arguments. Escalona (2025) concludes that integrating rhetorical strategies such as hedges and boosters into classroom instruction is vital for developing academic language skills among Philippine university developing researchers.</w:t>
+        <w:t>A 2024 ASEAN-wide study using the ICNALE learner corpus found that EFL learners across ten countries, including the Philippines, exhibit a preference for boosters over hedges. Ningrum, Puspita, and Mulyadi (2024) noted that learners overused boosters such as completely, really, and always, while they also showed patterns in hedges such as usually, often, and maybe. This suggests a regional tendency toward assertiveness rather than caution in developing researchers' writing. Locally, Escalona (2025) examined hedges and boosters in the essays of AB-English and BS-Information Technology developing researchers at Bukidnon State University. The study found that developing researchers’ use of these devices varied by discipline. IT developing researchers showed greater reliance on hedges to convey caution given the technical and rapidly evolving nature of their field. English language developing researchers showed greater preference for boosters in asserting arguments. Escalona (2025) concludes that integrating rhetorical strategies such as hedges and boosters into classroom instruction is vital for developing academic language skills among Philippine university developing researchers.</w:t>
       </w:r>
     </w:p>
     <w:p>
@@ -1078,7 +1078,7 @@
           <w:i w:val="0"/>
           <w:sz w:val="22"/>
         </w:rPr>
-        <w:t>Across the bodies of literature reviewed, a consistent picture emerges. Expert writers in scientific and medical fields demonstrate measurable disciplinary differentiation in hedging. They do not hedge more or less simply because one field is harder than another. Rather, different fields create distinct epistemic demands that shape how writers manage claim responsibility (Salager-Meyer, 1994). In contrast, developing researchers across multiple contexts show limited hedge variety. They tend to default to modal verbs and underuse more context-specific devices, regardless of discipline (Khunasathitchai et al., 2025; Wang, 2022). L2 and EFL developing researchers face an additional layer of constraint. Linguistic factors and limited explicit instruction often suppress the richer hedging repertoire that disciplinary socialization might otherwise produce (Demir, 2018; Petchkij, 2019). Philippine developing researchers navigate a particularly challenging landscape. English serves as the medium of instruction, but it is rarely reinforced by everyday language use. Regional studies, including ASEAN-wide analyses and local Philippine investigations, confirm a general reliance on modal verbs and a tendency toward boosters in some contexts (Rahayu &amp; Suhartono, 2024; Escalona, 2025; Lopez et al., 2025).</w:t>
+        <w:t>Across the bodies of literature reviewed, a consistent picture emerges. Expert writers in scientific and medical fields demonstrate measurable disciplinary differentiation in hedging. They do not hedge more or less simply because one field is harder than another. Rather, different fields create distinct epistemic demands that shape how writers manage claim responsibility (Salager-Meyer, 1994). In contrast, developing researchers across multiple contexts show limited hedge variety. They tend to default to modal verbs and underuse more context-specific devices, regardless of discipline (Khunasathitchai et al., 2025; Wang, 2022). L2 and EFL developing researchers face an additional layer of constraint. Linguistic factors and limited explicit instruction often suppress the richer hedging repertoire that disciplinary socialization might otherwise produce (Demir, 2018; Petchkij, 2019). Philippine developing researchers navigate a particularly challenging landscape. English serves as the medium of instruction, but it is rarely reinforced by everyday language use. Regional studies, including ASEAN-wide analyses and local Philippine investigations, confirm a general reliance on modal verbs and a tendency toward boosters in some contexts (Ningrum et al., 2024; Escalona, 2025; Lopez et al., 2025).</w:t>
       </w:r>
     </w:p>
     <w:p>
@@ -7038,7 +7038,7 @@
           <w:i w:val="0"/>
           <w:sz w:val="22"/>
         </w:rPr>
-        <w:t xml:space="preserve">Petchkij, W. (2019). Explicit teaching of hedges: Bringing hedging in academic writing into the Thai EFL classroom. </w:t>
+        <w:t xml:space="preserve">Ningrum, S., Puspita, H., &amp; Mulyadi, A. I. (2024). Hedges and boosters in academic writing of ASEAN EFL learners. </w:t>
       </w:r>
       <w:r>
         <w:rPr>
@@ -7047,16 +7047,16 @@
           <w:i/>
           <w:sz w:val="22"/>
         </w:rPr>
-        <w:t>E-FLT (Electronic Journal of Foreign Language Teaching), 16</w:t>
-      </w:r>
-      <w:r>
-        <w:rPr>
-          <w:rFonts w:ascii="Georgia" w:hAnsi="Georgia" w:eastAsia="Georgia"/>
-          <w:b w:val="0"/>
-          <w:i w:val="0"/>
-          <w:sz w:val="22"/>
-        </w:rPr>
-        <w:t>(1), 1–22. https://e-flt.nus.edu.sg/wp-content/uploads/2020/09/petchkij.pdf</w:t>
+        <w:t>Journal of English Education and Teaching, 8</w:t>
+      </w:r>
+      <w:r>
+        <w:rPr>
+          <w:rFonts w:ascii="Georgia" w:hAnsi="Georgia" w:eastAsia="Georgia"/>
+          <w:b w:val="0"/>
+          <w:i w:val="0"/>
+          <w:sz w:val="22"/>
+        </w:rPr>
+        <w:t>(1), 202–218. https://doi.org/10.33369/jeet.8.1.202-218</w:t>
       </w:r>
     </w:p>
     <w:p>
@@ -7072,7 +7072,7 @@
           <w:i w:val="0"/>
           <w:sz w:val="22"/>
         </w:rPr>
-        <w:t xml:space="preserve">Rahayu, S., &amp; Suhartono, S. (2024). Hedges and boosters in academic writing of ASEAN EFL learners. </w:t>
+        <w:t xml:space="preserve">Petchkij, W. (2019). Explicit teaching of hedges: Bringing hedging in academic writing into the Thai EFL classroom. </w:t>
       </w:r>
       <w:r>
         <w:rPr>
@@ -7081,16 +7081,16 @@
           <w:i/>
           <w:sz w:val="22"/>
         </w:rPr>
-        <w:t>Journal of English Education and Teaching, 8</w:t>
-      </w:r>
-      <w:r>
-        <w:rPr>
-          <w:rFonts w:ascii="Georgia" w:hAnsi="Georgia" w:eastAsia="Georgia"/>
-          <w:b w:val="0"/>
-          <w:i w:val="0"/>
-          <w:sz w:val="22"/>
-        </w:rPr>
-        <w:t>(1), 202–218. https://doi.org/10.33369/jeet.8.1.202-218</w:t>
+        <w:t>Electronic Journal of Foreign Language Teaching, 16(1), 95–113. https://e-flt.nus.edu.sg/wp-content/uploads/2020/09/petchkij.pdf</w:t>
+      </w:r>
+      <w:r>
+        <w:rPr>
+          <w:rFonts w:ascii="Georgia" w:hAnsi="Georgia" w:eastAsia="Georgia"/>
+          <w:b w:val="0"/>
+          <w:i w:val="0"/>
+          <w:sz w:val="22"/>
+        </w:rPr>
+        <w:t/>
       </w:r>
     </w:p>
     <w:p>

</xml_diff>

<commit_message>
Draft_005: soften Escalona claim; exact Khunasathitchai 1.47
- Escalona: major-field contrast now framed as non-significant
  descriptive pattern (matches source p=0.463)
- Khunasathitchai: 1.5 → 1.47 (exact figure from Table 4)
- Afshar Agriculture-fewest claim confirmed accurate; unchanged
Overwrite Draft_005.
</commit_message>
<xml_diff>
--- a/thesis/003_ThesisProposal_Draft_005.docx
+++ b/thesis/003_ThesisProposal_Draft_005.docx
@@ -818,7 +818,7 @@
           <w:i w:val="0"/>
           <w:sz w:val="22"/>
         </w:rPr>
-        <w:t>Recent studies consistently find that developing researchers underuse hedging and rely on a narrow range of devices. In an analysis of 60 research abstracts by Thai undergraduate English majors, Khunasathitchai et al. (2025) found an average of only 1.5 hedges per abstract. They observed that modal verbs dominated across all types of claims. Suratno and Aydawati (2025) reported similar patterns in the discussion sections of Indonesian undergraduate theses. They noted that developing researchers relied on one or two modal words regardless of argument type. The authors attribute this limitation to a lack of explicit instruction rather than a lack of grammatical ability. Working on a larger scale, Wang (2022) examined 829 papers by developing researchers across 16 fields in the Michigan Corpus of Upper-Level Student Papers. This study confirmed that disciplinary variation in hedging is detectable even in developing researchers' writing. For instance, researchers in Philosophy and Psychology hedged more than those in Physics and History. However, modal verbs remained the dominant form across all disciplines.</w:t>
+        <w:t>Recent studies consistently find that developing researchers underuse hedging and rely on a narrow range of devices. In an analysis of 60 research abstracts by Thai undergraduate English majors, Khunasathitchai et al. (2025) found an average of only 1.47 hedges per abstract. They observed that modal verbs dominated across all types of claims. Suratno and Aydawati (2025) reported similar patterns in the discussion sections of Indonesian undergraduate theses. They noted that developing researchers relied on one or two modal words regardless of argument type. The authors attribute this limitation to a lack of explicit instruction rather than a lack of grammatical ability. Working on a larger scale, Wang (2022) examined 829 papers by developing researchers across 16 fields in the Michigan Corpus of Upper-Level Student Papers. This study confirmed that disciplinary variation in hedging is detectable even in developing researchers' writing. For instance, researchers in Philosophy and Psychology hedged more than those in Physics and History. However, modal verbs remained the dominant form across all disciplines.</w:t>
       </w:r>
     </w:p>
     <w:p>
@@ -981,7 +981,7 @@
           <w:i w:val="0"/>
           <w:sz w:val="22"/>
         </w:rPr>
-        <w:t>A 2024 ASEAN-wide study using the ICNALE learner corpus found that EFL learners across ten countries, including the Philippines, exhibit a preference for boosters over hedges. Ningrum, Puspita, and Mulyadi (2024) noted that learners overused boosters such as completely, really, and always, while they also showed patterns in hedges such as usually, often, and maybe. This suggests a regional tendency toward assertiveness rather than caution in developing researchers' writing. Locally, Escalona (2025) examined hedges and boosters in the essays of AB-English and BS-Information Technology developing researchers at Bukidnon State University. The study found that developing researchers’ use of these devices varied by discipline. IT developing researchers showed greater reliance on hedges to convey caution given the technical and rapidly evolving nature of their field. English language developing researchers showed greater preference for boosters in asserting arguments. Escalona (2025) concludes that integrating rhetorical strategies such as hedges and boosters into classroom instruction is vital for developing academic language skills among Philippine university developing researchers.</w:t>
+        <w:t>A 2024 ASEAN-wide study using the ICNALE learner corpus found that EFL learners across ten countries, including the Philippines, exhibit a preference for boosters over hedges. Ningrum, Puspita, and Mulyadi (2024) noted that learners overused boosters such as completely, really, and always, while they also showed patterns in hedges such as usually, often, and maybe. This suggests a regional tendency toward assertiveness rather than caution in developing researchers' writing. Locally, Escalona (2025) examined hedges and boosters in the essays of AB-English and BS-Information Technology developing researchers at Bukidnon State University. Although major-field differences were not statistically significant, descriptive patterns showed IT developing researchers using slightly more hedges and English language developing researchers using slightly more boosters—a tendency Escalona links to the technical versus persuasive orientations of the two fields. Escalona (2025) concludes that integrating rhetorical strategies such as hedges and boosters into classroom instruction is vital for developing academic language skills among Philippine university developing researchers.</w:t>
       </w:r>
     </w:p>
     <w:p>

</xml_diff>

<commit_message>
Draft_005: fix Afshar n, majority wording, Biology non-epistemic
- Afshar sample size: 60 → 180 (matches source)
- zero-hedge "majority" → "nearly half" (46.7%)
- Biology: topic-naming non-epistemic use tied to FPs, not coded hedges
No further ripple effects. Overwrite Draft_005.
</commit_message>
<xml_diff>
--- a/thesis/003_ThesisProposal_Draft_005.docx
+++ b/thesis/003_ThesisProposal_Draft_005.docx
@@ -867,7 +867,7 @@
           <w:i w:val="0"/>
           <w:sz w:val="22"/>
         </w:rPr>
-        <w:t>Expert-writing studies confirm that field norms shape hedging, though the pattern is more complex than a simple hard or soft science divide. Afshar et al. (2014) analyzed 60 research articles across humanities, basic sciences, and agriculture. They found that humanities disciplines used hedges most frequently, followed by basic sciences, with agriculture using the fewest. Mohammed (2011), however, found the reverse when comparing biochemistry and applied linguistics directly. Biochemistry articles contained more hedging forms than applied linguistics articles, with scientists hedging more than linguists overall. Hamidi et al. (2025) found that clinical science papers used slightly more hedges than basic science papers within the medical domain, though without statistical significance.</w:t>
+        <w:t>Expert-writing studies confirm that field norms shape hedging, though the pattern is more complex than a simple hard or soft science divide. Afshar et al. (2014) analyzed 180 research articles across humanities, basic sciences, and agriculture. They found that humanities disciplines used hedges most frequently, followed by basic sciences, with agriculture using the fewest. Mohammed (2011), however, found the reverse when comparing biochemistry and applied linguistics directly. Biochemistry articles contained more hedging forms than applied linguistics articles, with scientists hedging more than linguists overall. Hamidi et al. (2025) found that clinical science papers used slightly more hedges than basic science papers within the medical domain, though without statistical significance.</w:t>
       </w:r>
     </w:p>
     <w:p>
@@ -5884,7 +5884,7 @@
         <w:jc w:val="both"/>
       </w:pPr>
       <w:r>
-        <w:t>Taken together, three patterns in the data are consistent with what may be described as pro forma hedging: the acquisition of hedge-like lexical items without the corresponding epistemic function. First, the token “potential” accounts for 38.9% of all lexical hedges and appears in nearly identical syntactic frames across multiple abstracts (“the potential of X as a Y,” “has potential as an X”), suggesting formulaic rather than epistemically motivated deployment. Second, the uniform assignment of all 60 hedges to the Epistemic Caution function, with zero instances of Politeness or Discourse Organization, indicates that writers are not making functional rhetorical choices but defaulting to a single hedge type. Third, the 46.7% zero-hedge rate shows that the majority of writers do not engage hedging at all. When hedging does appear, it often takes the form of a learned lexical shell rather than a calibrated stance marker. This pattern aligns with Demir's (2018) finding that L2 writers underuse hedges for reasons that are partly linguistic, and Petchkij's (2019) observation that explicit instruction can change lexical frequency but not always functional range.</w:t>
+        <w:t>Taken together, three patterns in the data are consistent with what may be described as pro forma hedging: the acquisition of hedge-like lexical items without the corresponding epistemic function. First, the token “potential” accounts for 38.9% of all lexical hedges and appears in nearly identical syntactic frames across multiple abstracts (“the potential of X as a Y,” “has potential as an X”), suggesting formulaic rather than epistemically motivated deployment. Second, the uniform assignment of all 60 hedges to the Epistemic Caution function, with zero instances of Politeness or Discourse Organization, indicates that writers are not making functional rhetorical choices but defaulting to a single hedge type. Third, the 46.7% zero-hedge rate shows that nearly half of the writers do not engage hedging at all. When hedging does appear, it often takes the form of a learned lexical shell rather than a calibrated stance marker. This pattern aligns with Demir's (2018) finding that L2 writers underuse hedges for reasons that are partly linguistic, and Petchkij's (2019) observation that explicit instruction can change lexical frequency but not always functional range.</w:t>
       </w:r>
     </w:p>
     <w:p>
@@ -6093,7 +6093,7 @@
         <w:jc w:val="both"/>
       </w:pPr>
       <w:r>
-        <w:t>The discipline-specific patterns observed in this corpus suggest differences in epistemic stance, though the statistical evidence is borderline (Kruskal-Wallis p = .049) and the Agriculture-Biology contrast is outlier-dependent. The most defensible contrast is Veterinary Medicine's distinct pattern: its 65% zero-hedge rate and 0.18 density are substantially different from both Agriculture and Biology. Agriculture shows a tendency toward cautious implication, hedging applications while stating findings as settled, though this is partly driven by a single outlier abstract (Acs2). Biology shows lexical caution with heavy reliance on “potential” and “suggesting,” much of which is non-epistemic (topic-naming in aim statements). Veterinary Medicine shows assertive reporting, with over half of its abstracts containing zero hedges and the highest count of unhedged assertion sites. Where these patterns hold, they are consistent with Salager-Meyer's (1994) framework: each discipline may create distinct epistemic demands that shape how writers distribute claim responsibility, even at the undergraduate level. Generalization beyond this corpus, however, is not warranted.</w:t>
+        <w:t>The discipline-specific patterns observed in this corpus suggest differences in epistemic stance, though the statistical evidence is borderline (Kruskal-Wallis p = .049) and the Agriculture-Biology contrast is outlier-dependent. The most defensible contrast is Veterinary Medicine's distinct pattern: its 65% zero-hedge rate and 0.18 density are substantially different from both Agriculture and Biology. Agriculture shows a tendency toward cautious implication, hedging applications while stating findings as settled, though this is partly driven by a single outlier abstract (Acs2). Biology shows lexical caution with heavy reliance on “potential” and “suggesting” among coded hedges, alongside frequent topic-naming “potential” in aim statements (reflected in high false-positive counts). Veterinary Medicine shows assertive reporting, with over half of its abstracts containing zero hedges and the highest count of unhedged assertion sites. Where these patterns hold, they are consistent with Salager-Meyer's (1994) framework: each discipline may create distinct epistemic demands that shape how writers distribute claim responsibility, even at the undergraduate level. Generalization beyond this corpus, however, is not warranted.</w:t>
       </w:r>
     </w:p>
     <w:p>

</xml_diff>